<commit_message>
Final factual consistency correction on submission Word document
</commit_message>
<xml_diff>
--- a/Darukaa_Earth_Biodiversity_Intelligence_Submission.docx
+++ b/Darukaa_Earth_Biodiversity_Intelligence_Submission.docx
@@ -54,7 +54,7 @@
       <w:tr>
         <w:tc>
           <w:tcPr>
-            <w:tcW w:type="dxa" w:w="3024"/>
+            <w:tcW w:type="dxa" w:w="3312"/>
             <w:shd w:fill="1B4D3E"/>
             <w:tcMar>
               <w:top w:w="130" w:type="dxa"/>
@@ -80,7 +80,7 @@
         </w:tc>
         <w:tc>
           <w:tcPr>
-            <w:tcW w:type="dxa" w:w="6336"/>
+            <w:tcW w:type="dxa" w:w="6048"/>
             <w:shd w:fill="1B4D3E"/>
             <w:tcMar>
               <w:top w:w="130" w:type="dxa"/>
@@ -108,7 +108,7 @@
       <w:tr>
         <w:tc>
           <w:tcPr>
-            <w:tcW w:type="dxa" w:w="3024"/>
+            <w:tcW w:type="dxa" w:w="3312"/>
             <w:shd w:fill="FFFFFF"/>
             <w:tcMar>
               <w:top w:w="100" w:type="dxa"/>
@@ -134,7 +134,7 @@
         </w:tc>
         <w:tc>
           <w:tcPr>
-            <w:tcW w:type="dxa" w:w="6336"/>
+            <w:tcW w:type="dxa" w:w="6048"/>
             <w:shd w:fill="FFFFFF"/>
             <w:tcMar>
               <w:top w:w="100" w:type="dxa"/>
@@ -162,7 +162,7 @@
       <w:tr>
         <w:tc>
           <w:tcPr>
-            <w:tcW w:type="dxa" w:w="3024"/>
+            <w:tcW w:type="dxa" w:w="3312"/>
             <w:shd w:fill="F9FAFB"/>
             <w:tcMar>
               <w:top w:w="100" w:type="dxa"/>
@@ -188,7 +188,7 @@
         </w:tc>
         <w:tc>
           <w:tcPr>
-            <w:tcW w:type="dxa" w:w="6336"/>
+            <w:tcW w:type="dxa" w:w="6048"/>
             <w:shd w:fill="F9FAFB"/>
             <w:tcMar>
               <w:top w:w="100" w:type="dxa"/>
@@ -216,7 +216,7 @@
       <w:tr>
         <w:tc>
           <w:tcPr>
-            <w:tcW w:type="dxa" w:w="3024"/>
+            <w:tcW w:type="dxa" w:w="3312"/>
             <w:shd w:fill="FFFFFF"/>
             <w:tcMar>
               <w:top w:w="100" w:type="dxa"/>
@@ -242,7 +242,7 @@
         </w:tc>
         <w:tc>
           <w:tcPr>
-            <w:tcW w:type="dxa" w:w="6336"/>
+            <w:tcW w:type="dxa" w:w="6048"/>
             <w:shd w:fill="FFFFFF"/>
             <w:tcMar>
               <w:top w:w="100" w:type="dxa"/>
@@ -273,7 +273,7 @@
       <w:tr>
         <w:tc>
           <w:tcPr>
-            <w:tcW w:type="dxa" w:w="3024"/>
+            <w:tcW w:type="dxa" w:w="3312"/>
             <w:shd w:fill="F9FAFB"/>
             <w:tcMar>
               <w:top w:w="100" w:type="dxa"/>
@@ -299,7 +299,7 @@
         </w:tc>
         <w:tc>
           <w:tcPr>
-            <w:tcW w:type="dxa" w:w="6336"/>
+            <w:tcW w:type="dxa" w:w="6048"/>
             <w:shd w:fill="F9FAFB"/>
             <w:tcMar>
               <w:top w:w="100" w:type="dxa"/>
@@ -327,7 +327,7 @@
       <w:tr>
         <w:tc>
           <w:tcPr>
-            <w:tcW w:type="dxa" w:w="3024"/>
+            <w:tcW w:type="dxa" w:w="3312"/>
             <w:shd w:fill="FFFFFF"/>
             <w:tcMar>
               <w:top w:w="100" w:type="dxa"/>
@@ -353,7 +353,7 @@
         </w:tc>
         <w:tc>
           <w:tcPr>
-            <w:tcW w:type="dxa" w:w="6336"/>
+            <w:tcW w:type="dxa" w:w="6048"/>
             <w:shd w:fill="FFFFFF"/>
             <w:tcMar>
               <w:top w:w="100" w:type="dxa"/>
@@ -384,7 +384,7 @@
       <w:tr>
         <w:tc>
           <w:tcPr>
-            <w:tcW w:type="dxa" w:w="3024"/>
+            <w:tcW w:type="dxa" w:w="3312"/>
             <w:shd w:fill="F9FAFB"/>
             <w:tcMar>
               <w:top w:w="100" w:type="dxa"/>
@@ -410,7 +410,7 @@
         </w:tc>
         <w:tc>
           <w:tcPr>
-            <w:tcW w:type="dxa" w:w="6336"/>
+            <w:tcW w:type="dxa" w:w="6048"/>
             <w:shd w:fill="F9FAFB"/>
             <w:tcMar>
               <w:top w:w="100" w:type="dxa"/>
@@ -441,7 +441,7 @@
       <w:tr>
         <w:tc>
           <w:tcPr>
-            <w:tcW w:type="dxa" w:w="3024"/>
+            <w:tcW w:type="dxa" w:w="3312"/>
             <w:shd w:fill="FFFFFF"/>
             <w:tcMar>
               <w:top w:w="100" w:type="dxa"/>
@@ -467,7 +467,7 @@
         </w:tc>
         <w:tc>
           <w:tcPr>
-            <w:tcW w:type="dxa" w:w="6336"/>
+            <w:tcW w:type="dxa" w:w="6048"/>
             <w:shd w:fill="FFFFFF"/>
             <w:tcMar>
               <w:top w:w="100" w:type="dxa"/>
@@ -498,7 +498,7 @@
       <w:tr>
         <w:tc>
           <w:tcPr>
-            <w:tcW w:type="dxa" w:w="3024"/>
+            <w:tcW w:type="dxa" w:w="3312"/>
             <w:shd w:fill="F9FAFB"/>
             <w:tcMar>
               <w:top w:w="100" w:type="dxa"/>
@@ -524,7 +524,7 @@
         </w:tc>
         <w:tc>
           <w:tcPr>
-            <w:tcW w:type="dxa" w:w="6336"/>
+            <w:tcW w:type="dxa" w:w="6048"/>
             <w:shd w:fill="F9FAFB"/>
             <w:tcMar>
               <w:top w:w="100" w:type="dxa"/>
@@ -555,7 +555,7 @@
       <w:tr>
         <w:tc>
           <w:tcPr>
-            <w:tcW w:type="dxa" w:w="3024"/>
+            <w:tcW w:type="dxa" w:w="3312"/>
             <w:shd w:fill="FFFFFF"/>
             <w:tcMar>
               <w:top w:w="100" w:type="dxa"/>
@@ -575,13 +575,13 @@
                 <w:color w:val="1F2937"/>
                 <w:sz w:val="18"/>
               </w:rPr>
-              <w:t>Final Deployed Commit</w:t>
+              <w:t>Final Application Deployment Commit</w:t>
             </w:r>
           </w:p>
         </w:tc>
         <w:tc>
           <w:tcPr>
-            <w:tcW w:type="dxa" w:w="6336"/>
+            <w:tcW w:type="dxa" w:w="6048"/>
             <w:shd w:fill="FFFFFF"/>
             <w:tcMar>
               <w:top w:w="100" w:type="dxa"/>
@@ -601,7 +601,7 @@
                 <w:color w:val="1F2937"/>
                 <w:sz w:val="18"/>
               </w:rPr>
-              <w:t>678ea98 ('Refine soil moisture and SOC interpretations for scientific grounding')</w:t>
+              <w:t>Final application deployment commit: 678ea98 — Refine soil moisture and SOC interpretations for scientific grounding</w:t>
             </w:r>
           </w:p>
         </w:tc>
@@ -609,7 +609,7 @@
       <w:tr>
         <w:tc>
           <w:tcPr>
-            <w:tcW w:type="dxa" w:w="3024"/>
+            <w:tcW w:type="dxa" w:w="3312"/>
             <w:shd w:fill="F9FAFB"/>
             <w:tcMar>
               <w:top w:w="100" w:type="dxa"/>
@@ -635,7 +635,7 @@
         </w:tc>
         <w:tc>
           <w:tcPr>
-            <w:tcW w:type="dxa" w:w="6336"/>
+            <w:tcW w:type="dxa" w:w="6048"/>
             <w:shd w:fill="F9FAFB"/>
             <w:tcMar>
               <w:top w:w="100" w:type="dxa"/>
@@ -663,7 +663,7 @@
       <w:tr>
         <w:tc>
           <w:tcPr>
-            <w:tcW w:type="dxa" w:w="3024"/>
+            <w:tcW w:type="dxa" w:w="3312"/>
             <w:shd w:fill="FFFFFF"/>
             <w:tcMar>
               <w:top w:w="100" w:type="dxa"/>
@@ -689,7 +689,7 @@
         </w:tc>
         <w:tc>
           <w:tcPr>
-            <w:tcW w:type="dxa" w:w="6336"/>
+            <w:tcW w:type="dxa" w:w="6048"/>
             <w:shd w:fill="FFFFFF"/>
             <w:tcMar>
               <w:top w:w="100" w:type="dxa"/>
@@ -717,7 +717,7 @@
       <w:tr>
         <w:tc>
           <w:tcPr>
-            <w:tcW w:type="dxa" w:w="3024"/>
+            <w:tcW w:type="dxa" w:w="3312"/>
             <w:shd w:fill="F9FAFB"/>
             <w:tcMar>
               <w:top w:w="100" w:type="dxa"/>
@@ -743,7 +743,7 @@
         </w:tc>
         <w:tc>
           <w:tcPr>
-            <w:tcW w:type="dxa" w:w="6336"/>
+            <w:tcW w:type="dxa" w:w="6048"/>
             <w:shd w:fill="F9FAFB"/>
             <w:tcMar>
               <w:top w:w="100" w:type="dxa"/>
@@ -771,7 +771,7 @@
       <w:tr>
         <w:tc>
           <w:tcPr>
-            <w:tcW w:type="dxa" w:w="3024"/>
+            <w:tcW w:type="dxa" w:w="3312"/>
             <w:shd w:fill="FFFFFF"/>
             <w:tcMar>
               <w:top w:w="100" w:type="dxa"/>
@@ -797,7 +797,7 @@
         </w:tc>
         <w:tc>
           <w:tcPr>
-            <w:tcW w:type="dxa" w:w="6336"/>
+            <w:tcW w:type="dxa" w:w="6048"/>
             <w:shd w:fill="FFFFFF"/>
             <w:tcMar>
               <w:top w:w="100" w:type="dxa"/>
@@ -825,7 +825,7 @@
       <w:tr>
         <w:tc>
           <w:tcPr>
-            <w:tcW w:type="dxa" w:w="3024"/>
+            <w:tcW w:type="dxa" w:w="3312"/>
             <w:shd w:fill="F9FAFB"/>
             <w:tcMar>
               <w:top w:w="100" w:type="dxa"/>
@@ -851,7 +851,7 @@
         </w:tc>
         <w:tc>
           <w:tcPr>
-            <w:tcW w:type="dxa" w:w="6336"/>
+            <w:tcW w:type="dxa" w:w="6048"/>
             <w:shd w:fill="F9FAFB"/>
             <w:tcMar>
               <w:top w:w="100" w:type="dxa"/>
@@ -921,7 +921,7 @@
                 <w:color w:val="1F2937"/>
                 <w:sz w:val="18"/>
               </w:rPr>
-              <w:t>Repository Access Note: The GitHub repository is fully public and accessible at https://github.com/Shivaram7-29/darukaa-biodiversity-ai. Per hackathon guidelines, if private permissions are ever requested, reviewer access is pre-authorized for: ankita.dasgupta@darukaa.com, harsh.kumar@darukaa.com, utkarsh.gauniyal@darukaa.com, and guneet.mutreja@darukaa.com.</w:t>
+              <w:t>Repository Access Note: The GitHub repository is public and accessible at https://github.com/Shivaram7-29/darukaa-biodiversity-ai. Per hackathon guidelines, if private reviewer permissions are ever requested, access is pre-authorized for: ankita.dasgupta@darukaa.com, harsh.kumar@darukaa.com, utkarsh.gauniyal@darukaa.com, and guneet.mutreja@darukaa.com.</w:t>
             </w:r>
           </w:p>
         </w:tc>
@@ -953,7 +953,7 @@
         <w:spacing w:after="80"/>
       </w:pPr>
       <w:r>
-        <w:t>Agricultural and ecological landscapes globally face catastrophic degradation driven by soil depletion, biodiversity collapse, water scarcity, and climatic volatility. Land managers, agriculturalists, and conservationists frequently struggle to formulate effective restoration plans because environmental systems are governed by complex, compounding interactions among soil chemistry, hydrology, biological diversity, and climate variables.</w:t>
+        <w:t>Agricultural and ecological landscapes face degradation driven by soil depletion, biodiversity loss, water scarcity, and climatic variability. Land managers, agriculturalists, and conservationists frequently struggle to formulate effective restoration plans because environmental systems are governed by complex, compounding interactions among soil chemistry, hydrology, biological diversity, and climatic drivers.</w:t>
       </w:r>
     </w:p>
     <w:p>
@@ -988,7 +988,7 @@
         <w:rPr>
           <w:color w:val="374151"/>
         </w:rPr>
-        <w:t>Generic LLMs evaluate prompts probabilistically, often producing plausible-sounding hallucinations, confusing biological timelines, or issuing ungrounded advice. Darukaa.Earth couples a deterministic multi-metric reasoning engine with a vector database of 57 curated knowledge entries/chunks grounded in authoritative scientific literature and reports (FAO, IPCC, IPBES, USDA-NRCS, Brady &amp; Weil, Lal, Montgomery).</w:t>
+        <w:t>Generic LLMs evaluate prompts probabilistically, which can result in unsupported assertions, confused biological timelines, or ungrounded prescriptions. Darukaa.Earth couples a deterministic multi-metric reasoning engine with a vector database of 57 curated knowledge entries/chunks grounded in authoritative scientific literature and reports (FAO, IPCC, IPBES, USDA-NRCS, Brady &amp; Weil, Lal, Montgomery).</w:t>
       </w:r>
     </w:p>
     <w:p>
@@ -1007,7 +1007,7 @@
         <w:rPr>
           <w:color w:val="374151"/>
         </w:rPr>
-        <w:t>Single-variable advice is frequently dangerous (e.g. adding nitrogen without checking pH risks aluminum toxicity; prescribing heavy water extraction in drought risks aquifer depletion). The system evaluates compound constraints across 3 or more variables simultaneously.</w:t>
+        <w:t>Single-variable advice is frequently problematic (for instance, amending nitrogen without verifying soil pH risks aluminum toxicity; prescribing intensive water extraction in moisture-limited soils can deplete groundwater reserves). The system evaluates compound constraints across 3 or more variables simultaneously.</w:t>
       </w:r>
     </w:p>
     <w:p>
@@ -1026,7 +1026,7 @@
         <w:rPr>
           <w:color w:val="374151"/>
         </w:rPr>
-        <w:t>When essential variables are missing, standard chatbots jump into ungrounded prescriptions. Darukaa.Earth proactively detects data gaps and leads with targeted clarifying questions, explaining scientifically why the missing parameters could alter or reverse the restoration strategy.</w:t>
+        <w:t>When vital variables are missing, standard chatbots often jump into ungrounded prescriptions. Darukaa.Earth proactively detects data gaps and leads with targeted clarifying questions, explaining scientifically why missing parameters could alter or reverse the recommended restoration strategy.</w:t>
       </w:r>
     </w:p>
     <w:p>
@@ -1045,7 +1045,7 @@
         <w:rPr>
           <w:color w:val="374151"/>
         </w:rPr>
-        <w:t>By enforcing strict scientific baselines, the system reduces the risk of unsupported or ungrounded responses through retrieval and scientific constraints, delivering actionable recommendations with explicit mechanisms, timelines, and literature citations.</w:t>
+        <w:t>By enforcing strict scientific baselines, the system provides a retrieved scientific grounding layer that constrains the generative response, delivering actionable recommendations with explicit mechanisms, timelines, and literature citations.</w:t>
       </w:r>
     </w:p>
     <w:p>
@@ -1239,7 +1239,7 @@
                 <w:color w:val="1F2937"/>
                 <w:sz w:val="18"/>
               </w:rPr>
-              <w:t>Comprehensive threshold checks and interaction models for soil pH (&lt;4.5, &lt;5.5, 6.0–7.0, &gt;8.5), soil organic carbon (&lt;0.5% critical, &lt;1.0% low, 2.0% moderate), and soil moisture.</w:t>
+              <w:t>Comprehensive threshold checks and interaction models for soil pH (&lt;4.5, &lt;5.5, 6.0–7.0, &gt;8.5), soil organic carbon (&lt;0.5% critical, &lt;1.0% low, 2.0% moderate), and reported soil moisture.</w:t>
             </w:r>
           </w:p>
         </w:tc>
@@ -1563,7 +1563,7 @@
                 <w:color w:val="1F2937"/>
                 <w:sz w:val="18"/>
               </w:rPr>
-              <w:t>Strict prompt constraints enforce literature citations (FAO, IPCC, Brady &amp; Weil) and eliminate unverified claims (no raw moisture converted to % FC; no unbacked 2–6% SOC claims).</w:t>
+              <w:t>Strict prompt constraints enforce literature citations (FAO, IPCC, Brady &amp; Weil) and constrain responses to verified evidence (distinguishing raw moisture from % FC and avoiding ungrounded SOC baseline comparisons).</w:t>
             </w:r>
           </w:p>
         </w:tc>
@@ -1779,7 +1779,7 @@
                 <w:color w:val="1F2937"/>
                 <w:sz w:val="18"/>
               </w:rPr>
-              <w:t>Dual-input interface: free-form natural language queries or 14-parameter structured environmental panel via Streamlit and FastAPI REST payload.</w:t>
+              <w:t>Dual-input interface: free-form natural language queries or structured input supporting all 14 EnvironmentalData fields via Streamlit and FastAPI REST payload.</w:t>
             </w:r>
           </w:p>
         </w:tc>
@@ -1912,7 +1912,7 @@
               <w:br/>
               <w:t>[Deterministic Reasoning Engine: src/reasoning.py]</w:t>
               <w:br/>
-              <w:t xml:space="preserve">    ── Extracts 14 environmental variables (SOC, pH, moisture, rain, temp, land use, etc.)</w:t>
+              <w:t xml:space="preserve">    ── Extracts 14 environmental fields (SOC, pH, moisture, rain, temp, land use, etc.)</w:t>
               <w:br/>
               <w:t xml:space="preserve">    ── Checks quantitative thresholds against authoritative agronomic baselines</w:t>
               <w:br/>
@@ -2233,7 +2233,7 @@
         <w:rPr>
           <w:color w:val="374151"/>
         </w:rPr>
-        <w:t>All 57 knowledge embeddings are precomputed into 'data/environmental_data/precomputed_embeddings.json'. ChromaDB loads cached vectors instantly on startup, executing zero embedding API calls and eliminating boot latency.</w:t>
+        <w:t>All 57 knowledge embeddings are precomputed into 'data/environmental_data/precomputed_embeddings.json'. ChromaDB loads cached vectors instantly on startup, executing zero embedding API calls and ensuring sub-second boot time.</w:t>
       </w:r>
     </w:p>
     <w:p>
@@ -3260,7 +3260,7 @@
                 <w:color w:val="1F2937"/>
                 <w:sz w:val="18"/>
               </w:rPr>
-              <w:t>Strongly acidic conditions induce aluminum toxicity and phosphorus fixation, while depleted SOC eliminates cation exchange capacity and moisture buffering. Liming and organic buffering must precede biological inoculants to allow root establishment.</w:t>
+              <w:t>Strongly acidic conditions induce potential aluminum toxicity and phosphorus fixation, while depleted SOC severely impairs cation exchange capacity and moisture buffering. Liming and organic buffering must precede biological nitrogen-fixing interventions to allow root establishment.</w:t>
             </w:r>
           </w:p>
         </w:tc>
@@ -3651,7 +3651,7 @@
         <w:br/>
         <w:t>Turn 2 — Follow-up Context: User replies: 'My soil pH is 5.2 and I practice continuous wheat monoculture.'</w:t>
         <w:br/>
-        <w:t>Assistant Response: Dynamically merges the new parameters (pH 5.2, wheat monoculture) with the earlier context. It now fires the Monoculture Vulnerability rule and delivers concrete, multi-variable recommendations: liming to address acidity, followed by diversified crop rotations with deep-rooting legumes.</w:t>
+        <w:t>Assistant Response: Dynamically merges the new parameters (pH 5.2, wheat monoculture) with the earlier context. It now triggers the Monoculture Vulnerability compound rule and delivers concrete, multi-variable recommendations: liming to address acidity, followed by diversified crop rotations with deep-rooting legumes.</w:t>
       </w:r>
     </w:p>
     <w:p>
@@ -4001,7 +4001,7 @@
                 <w:color w:val="1F2937"/>
                 <w:sz w:val="18"/>
               </w:rPr>
-              <w:t>Numerical Precision Rule: Quantitative figures are included ONLY when directly backed by retrieved literature (e.g. 5–10 tonnes/ha/year compost application rate; 30–50% drip irrigation water savings over flood irrigation; 40–80% wetland nitrate removal). When the underlying process is texture-dependent (such as water retention gains from SOC or soil buffering stabilization), qualitative wording is strictly enforced to prevent false precision.</w:t>
+              <w:t>Quantitative claims are included only when directly supported by retrieved evidence. Where outcomes depend strongly on site conditions, such as soil texture, climate, management history, or baseline measurements, the system uses qualitative or site-specific wording rather than fixed numerical estimates.</w:t>
             </w:r>
           </w:p>
         </w:tc>
@@ -4028,7 +4028,7 @@
         <w:spacing w:after="80"/>
       </w:pPr>
       <w:r>
-        <w:t>The system accepts both unstructured natural language messages and structured environmental data. The FastAPI backend validates all inputs via the EnvironmentalData Pydantic model supporting 14 distinct parameters:</w:t>
+        <w:t>The system accepts both unstructured natural language messages and structured environmental data. The FastAPI backend validates all inputs via Pydantic v2. EnvironmentalData supports 14 fields. In particular: soil_moisture float — Reported soil-moisture value; interpretation depends on the measurement convention supplied by the user.</w:t>
       </w:r>
     </w:p>
     <w:tbl>
@@ -4072,7 +4072,7 @@
         </w:tc>
         <w:tc>
           <w:tcPr>
-            <w:tcW w:type="dxa" w:w="1872"/>
+            <w:tcW w:type="dxa" w:w="1728"/>
             <w:shd w:fill="1B4D3E"/>
             <w:tcMar>
               <w:top w:w="130" w:type="dxa"/>
@@ -4098,7 +4098,7 @@
         </w:tc>
         <w:tc>
           <w:tcPr>
-            <w:tcW w:type="dxa" w:w="4752"/>
+            <w:tcW w:type="dxa" w:w="4896"/>
             <w:shd w:fill="1B4D3E"/>
             <w:tcMar>
               <w:top w:w="130" w:type="dxa"/>
@@ -4152,7 +4152,7 @@
         </w:tc>
         <w:tc>
           <w:tcPr>
-            <w:tcW w:type="dxa" w:w="1872"/>
+            <w:tcW w:type="dxa" w:w="1728"/>
             <w:shd w:fill="FFFFFF"/>
             <w:tcMar>
               <w:top w:w="100" w:type="dxa"/>
@@ -4178,7 +4178,7 @@
         </w:tc>
         <w:tc>
           <w:tcPr>
-            <w:tcW w:type="dxa" w:w="4752"/>
+            <w:tcW w:type="dxa" w:w="4896"/>
             <w:shd w:fill="FFFFFF"/>
             <w:tcMar>
               <w:top w:w="100" w:type="dxa"/>
@@ -4232,7 +4232,7 @@
         </w:tc>
         <w:tc>
           <w:tcPr>
-            <w:tcW w:type="dxa" w:w="1872"/>
+            <w:tcW w:type="dxa" w:w="1728"/>
             <w:shd w:fill="F9FAFB"/>
             <w:tcMar>
               <w:top w:w="100" w:type="dxa"/>
@@ -4258,7 +4258,7 @@
         </w:tc>
         <w:tc>
           <w:tcPr>
-            <w:tcW w:type="dxa" w:w="4752"/>
+            <w:tcW w:type="dxa" w:w="4896"/>
             <w:shd w:fill="F9FAFB"/>
             <w:tcMar>
               <w:top w:w="100" w:type="dxa"/>
@@ -4312,7 +4312,7 @@
         </w:tc>
         <w:tc>
           <w:tcPr>
-            <w:tcW w:type="dxa" w:w="1872"/>
+            <w:tcW w:type="dxa" w:w="1728"/>
             <w:shd w:fill="FFFFFF"/>
             <w:tcMar>
               <w:top w:w="100" w:type="dxa"/>
@@ -4332,13 +4332,13 @@
                 <w:color w:val="1F2937"/>
                 <w:sz w:val="18"/>
               </w:rPr>
-              <w:t>float (%)</w:t>
+              <w:t>float</w:t>
             </w:r>
           </w:p>
         </w:tc>
         <w:tc>
           <w:tcPr>
-            <w:tcW w:type="dxa" w:w="4752"/>
+            <w:tcW w:type="dxa" w:w="4896"/>
             <w:shd w:fill="FFFFFF"/>
             <w:tcMar>
               <w:top w:w="100" w:type="dxa"/>
@@ -4358,7 +4358,7 @@
                 <w:color w:val="1F2937"/>
                 <w:sz w:val="18"/>
               </w:rPr>
-              <w:t>Soil moisture percentage (raw volumetric or % FC)</w:t>
+              <w:t>Reported soil-moisture value; interpretation depends on the measurement convention supplied by the user.</w:t>
             </w:r>
           </w:p>
         </w:tc>
@@ -4392,7 +4392,7 @@
         </w:tc>
         <w:tc>
           <w:tcPr>
-            <w:tcW w:type="dxa" w:w="1872"/>
+            <w:tcW w:type="dxa" w:w="1728"/>
             <w:shd w:fill="F9FAFB"/>
             <w:tcMar>
               <w:top w:w="100" w:type="dxa"/>
@@ -4418,7 +4418,7 @@
         </w:tc>
         <w:tc>
           <w:tcPr>
-            <w:tcW w:type="dxa" w:w="4752"/>
+            <w:tcW w:type="dxa" w:w="4896"/>
             <w:shd w:fill="F9FAFB"/>
             <w:tcMar>
               <w:top w:w="100" w:type="dxa"/>
@@ -4472,7 +4472,7 @@
         </w:tc>
         <w:tc>
           <w:tcPr>
-            <w:tcW w:type="dxa" w:w="1872"/>
+            <w:tcW w:type="dxa" w:w="1728"/>
             <w:shd w:fill="FFFFFF"/>
             <w:tcMar>
               <w:top w:w="100" w:type="dxa"/>
@@ -4498,7 +4498,7 @@
         </w:tc>
         <w:tc>
           <w:tcPr>
-            <w:tcW w:type="dxa" w:w="4752"/>
+            <w:tcW w:type="dxa" w:w="4896"/>
             <w:shd w:fill="FFFFFF"/>
             <w:tcMar>
               <w:top w:w="100" w:type="dxa"/>
@@ -4552,7 +4552,7 @@
         </w:tc>
         <w:tc>
           <w:tcPr>
-            <w:tcW w:type="dxa" w:w="1872"/>
+            <w:tcW w:type="dxa" w:w="1728"/>
             <w:shd w:fill="F9FAFB"/>
             <w:tcMar>
               <w:top w:w="100" w:type="dxa"/>
@@ -4578,7 +4578,7 @@
         </w:tc>
         <w:tc>
           <w:tcPr>
-            <w:tcW w:type="dxa" w:w="4752"/>
+            <w:tcW w:type="dxa" w:w="4896"/>
             <w:shd w:fill="F9FAFB"/>
             <w:tcMar>
               <w:top w:w="100" w:type="dxa"/>
@@ -4632,7 +4632,7 @@
         </w:tc>
         <w:tc>
           <w:tcPr>
-            <w:tcW w:type="dxa" w:w="1872"/>
+            <w:tcW w:type="dxa" w:w="1728"/>
             <w:shd w:fill="FFFFFF"/>
             <w:tcMar>
               <w:top w:w="100" w:type="dxa"/>
@@ -4658,7 +4658,7 @@
         </w:tc>
         <w:tc>
           <w:tcPr>
-            <w:tcW w:type="dxa" w:w="4752"/>
+            <w:tcW w:type="dxa" w:w="4896"/>
             <w:shd w:fill="FFFFFF"/>
             <w:tcMar>
               <w:top w:w="100" w:type="dxa"/>
@@ -4712,7 +4712,7 @@
         </w:tc>
         <w:tc>
           <w:tcPr>
-            <w:tcW w:type="dxa" w:w="1872"/>
+            <w:tcW w:type="dxa" w:w="1728"/>
             <w:shd w:fill="F9FAFB"/>
             <w:tcMar>
               <w:top w:w="100" w:type="dxa"/>
@@ -4738,7 +4738,7 @@
         </w:tc>
         <w:tc>
           <w:tcPr>
-            <w:tcW w:type="dxa" w:w="4752"/>
+            <w:tcW w:type="dxa" w:w="4896"/>
             <w:shd w:fill="F9FAFB"/>
             <w:tcMar>
               <w:top w:w="100" w:type="dxa"/>
@@ -4792,7 +4792,7 @@
         </w:tc>
         <w:tc>
           <w:tcPr>
-            <w:tcW w:type="dxa" w:w="1872"/>
+            <w:tcW w:type="dxa" w:w="1728"/>
             <w:shd w:fill="FFFFFF"/>
             <w:tcMar>
               <w:top w:w="100" w:type="dxa"/>
@@ -4818,7 +4818,7 @@
         </w:tc>
         <w:tc>
           <w:tcPr>
-            <w:tcW w:type="dxa" w:w="4752"/>
+            <w:tcW w:type="dxa" w:w="4896"/>
             <w:shd w:fill="FFFFFF"/>
             <w:tcMar>
               <w:top w:w="100" w:type="dxa"/>
@@ -4872,7 +4872,7 @@
         </w:tc>
         <w:tc>
           <w:tcPr>
-            <w:tcW w:type="dxa" w:w="1872"/>
+            <w:tcW w:type="dxa" w:w="1728"/>
             <w:shd w:fill="F9FAFB"/>
             <w:tcMar>
               <w:top w:w="100" w:type="dxa"/>
@@ -4898,7 +4898,7 @@
         </w:tc>
         <w:tc>
           <w:tcPr>
-            <w:tcW w:type="dxa" w:w="4752"/>
+            <w:tcW w:type="dxa" w:w="4896"/>
             <w:shd w:fill="F9FAFB"/>
             <w:tcMar>
               <w:top w:w="100" w:type="dxa"/>
@@ -4952,7 +4952,7 @@
         </w:tc>
         <w:tc>
           <w:tcPr>
-            <w:tcW w:type="dxa" w:w="1872"/>
+            <w:tcW w:type="dxa" w:w="1728"/>
             <w:shd w:fill="FFFFFF"/>
             <w:tcMar>
               <w:top w:w="100" w:type="dxa"/>
@@ -4978,7 +4978,7 @@
         </w:tc>
         <w:tc>
           <w:tcPr>
-            <w:tcW w:type="dxa" w:w="4752"/>
+            <w:tcW w:type="dxa" w:w="4896"/>
             <w:shd w:fill="FFFFFF"/>
             <w:tcMar>
               <w:top w:w="100" w:type="dxa"/>
@@ -5026,13 +5026,13 @@
                 <w:color w:val="1F2937"/>
                 <w:sz w:val="18"/>
               </w:rPr>
-              <w:t>latitude / longitude</w:t>
+              <w:t>latitude</w:t>
             </w:r>
           </w:p>
         </w:tc>
         <w:tc>
           <w:tcPr>
-            <w:tcW w:type="dxa" w:w="1872"/>
+            <w:tcW w:type="dxa" w:w="1728"/>
             <w:shd w:fill="F9FAFB"/>
             <w:tcMar>
               <w:top w:w="100" w:type="dxa"/>
@@ -5058,7 +5058,7 @@
         </w:tc>
         <w:tc>
           <w:tcPr>
-            <w:tcW w:type="dxa" w:w="4752"/>
+            <w:tcW w:type="dxa" w:w="4896"/>
             <w:shd w:fill="F9FAFB"/>
             <w:tcMar>
               <w:top w:w="100" w:type="dxa"/>
@@ -5078,7 +5078,7 @@
                 <w:color w:val="1F2937"/>
                 <w:sz w:val="18"/>
               </w:rPr>
-              <w:t>Bonus geospatial coordinates for location binding</w:t>
+              <w:t>Latitude coordinate (bonus geospatial field)</w:t>
             </w:r>
           </w:p>
         </w:tc>
@@ -5106,14 +5106,94 @@
                 <w:color w:val="1F2937"/>
                 <w:sz w:val="18"/>
               </w:rPr>
+              <w:t>longitude</w:t>
+            </w:r>
+          </w:p>
+        </w:tc>
+        <w:tc>
+          <w:tcPr>
+            <w:tcW w:type="dxa" w:w="1728"/>
+            <w:shd w:fill="FFFFFF"/>
+            <w:tcMar>
+              <w:top w:w="100" w:type="dxa"/>
+              <w:bottom w:w="100" w:type="dxa"/>
+              <w:left w:w="150" w:type="dxa"/>
+              <w:right w:w="150" w:type="dxa"/>
+            </w:tcMar>
+          </w:tcPr>
+          <w:p>
+            <w:pPr>
+              <w:jc w:val="left"/>
+            </w:pPr>
+            <w:r/>
+            <w:r>
+              <w:rPr>
+                <w:rFonts w:ascii="Arial" w:hAnsi="Arial"/>
+                <w:color w:val="1F2937"/>
+                <w:sz w:val="18"/>
+              </w:rPr>
+              <w:t>float</w:t>
+            </w:r>
+          </w:p>
+        </w:tc>
+        <w:tc>
+          <w:tcPr>
+            <w:tcW w:type="dxa" w:w="4896"/>
+            <w:shd w:fill="FFFFFF"/>
+            <w:tcMar>
+              <w:top w:w="100" w:type="dxa"/>
+              <w:bottom w:w="100" w:type="dxa"/>
+              <w:left w:w="150" w:type="dxa"/>
+              <w:right w:w="150" w:type="dxa"/>
+            </w:tcMar>
+          </w:tcPr>
+          <w:p>
+            <w:pPr>
+              <w:jc w:val="left"/>
+            </w:pPr>
+            <w:r/>
+            <w:r>
+              <w:rPr>
+                <w:rFonts w:ascii="Arial" w:hAnsi="Arial"/>
+                <w:color w:val="1F2937"/>
+                <w:sz w:val="18"/>
+              </w:rPr>
+              <w:t>Longitude coordinate (bonus geospatial field)</w:t>
+            </w:r>
+          </w:p>
+        </w:tc>
+      </w:tr>
+      <w:tr>
+        <w:tc>
+          <w:tcPr>
+            <w:tcW w:type="dxa" w:w="2736"/>
+            <w:shd w:fill="F9FAFB"/>
+            <w:tcMar>
+              <w:top w:w="100" w:type="dxa"/>
+              <w:bottom w:w="100" w:type="dxa"/>
+              <w:left w:w="150" w:type="dxa"/>
+              <w:right w:w="150" w:type="dxa"/>
+            </w:tcMar>
+          </w:tcPr>
+          <w:p>
+            <w:pPr>
+              <w:jc w:val="left"/>
+            </w:pPr>
+            <w:r/>
+            <w:r>
+              <w:rPr>
+                <w:rFonts w:ascii="Arial" w:hAnsi="Arial"/>
+                <w:color w:val="1F2937"/>
+                <w:sz w:val="18"/>
+              </w:rPr>
               <w:t>additional_notes</w:t>
             </w:r>
           </w:p>
         </w:tc>
         <w:tc>
           <w:tcPr>
-            <w:tcW w:type="dxa" w:w="1872"/>
-            <w:shd w:fill="FFFFFF"/>
+            <w:tcW w:type="dxa" w:w="1728"/>
+            <w:shd w:fill="F9FAFB"/>
             <w:tcMar>
               <w:top w:w="100" w:type="dxa"/>
               <w:bottom w:w="100" w:type="dxa"/>
@@ -5138,8 +5218,8 @@
         </w:tc>
         <w:tc>
           <w:tcPr>
-            <w:tcW w:type="dxa" w:w="4752"/>
-            <w:shd w:fill="FFFFFF"/>
+            <w:tcW w:type="dxa" w:w="4896"/>
+            <w:shd w:fill="F9FAFB"/>
             <w:tcMar>
               <w:top w:w="100" w:type="dxa"/>
               <w:bottom w:w="100" w:type="dxa"/>
@@ -5851,7 +5931,7 @@
         <w:spacing w:after="80"/>
       </w:pPr>
       <w:r>
-        <w:t>Scientific knowledge is maintained in a normalized JSON catalog in data/environmental_data/knowledge.json. A simplified representative entry is illustrated below:</w:t>
+        <w:t>Scientific knowledge is maintained in a normalized JSON catalog in data/environmental_data/knowledge.json. Below is an authentic representative entry (ph_001) from the active knowledge base:</w:t>
       </w:r>
     </w:p>
     <w:tbl>
@@ -5887,29 +5967,35 @@
               </w:rPr>
               <w:t>{</w:t>
               <w:br/>
-              <w:t xml:space="preserve">  "id": "soc_001",</w:t>
+              <w:t xml:space="preserve">  "id": "ph_001",</w:t>
               <w:br/>
-              <w:t xml:space="preserve">  "topic": "soil organic carbon",</w:t>
+              <w:t xml:space="preserve">  "topic": "soil pH and nutrient availability",</w:t>
               <w:br/>
               <w:t xml:space="preserve">  "category": "soil_health",</w:t>
               <w:br/>
-              <w:t xml:space="preserve">  "environmental_variables": ["soil_organic_carbon", "soil_health", "biodiversity", "water_retention"],</w:t>
+              <w:t xml:space="preserve">  "environmental_variables": ["soil_ph", "nutrient_availability", "soil_biodiversity", "crop_productivity"],</w:t>
               <w:br/>
-              <w:t xml:space="preserve">  "knowledge": "Soil organic carbon (SOC) is a key indicator of soil health. SOC levels below 1% are considered degraded...",</w:t>
+              <w:t xml:space="preserve">  "knowledge": "Soil pH affects nutrient solubility and biological activity. Most crops grow best at pH 6.0-7.0. Below pH 5.5, aluminum and manganese toxicity can occur, and phosphorus becomes less available. Above pH 8.0, iron, zinc, and manganese become less available. Soil microbial diversity is generally highest at near-neutral pH (6.5-7.5).",</w:t>
               <w:br/>
               <w:t xml:space="preserve">  "thresholds": {</w:t>
               <w:br/>
-              <w:t xml:space="preserve">    "critical_low": 0.5, "low": 1.0, "moderate": 2.0, "good": 3.0, "excellent": 5.0, "unit": "percent"</w:t>
+              <w:t xml:space="preserve">    "strongly_acidic": 4.5,</w:t>
+              <w:br/>
+              <w:t xml:space="preserve">    "acidic": 5.5,</w:t>
+              <w:br/>
+              <w:t xml:space="preserve">    "neutral": 7.0,</w:t>
+              <w:br/>
+              <w:t xml:space="preserve">    "alkaline": 8.5,</w:t>
+              <w:br/>
+              <w:t xml:space="preserve">    "unit": "pH"</w:t>
               <w:br/>
               <w:t xml:space="preserve">  },</w:t>
               <w:br/>
               <w:t xml:space="preserve">  "interactions": {</w:t>
               <w:br/>
-              <w:t xml:space="preserve">    "soil_ph": "SOC decomposition rates are affected by pH; extreme pH slows organic matter turnover",</w:t>
+              <w:t xml:space="preserve">    "soil_organic_carbon": "SOC decomposition rates are affected by pH; strongly acidic or alkaline soils may slow organic matter turnover",</w:t>
               <w:br/>
-              <w:t xml:space="preserve">    "soil_moisture": "Adequate moisture promotes microbial decomposition and SOC cycling",</w:t>
-              <w:br/>
-              <w:t xml:space="preserve">    "temperature": "Higher temperatures generally accelerate SOC decomposition (Q10 effect)"</w:t>
+              <w:t xml:space="preserve">    "soil_moisture": "Moisture drives solute movement and dissolution of liming amendments"</w:t>
               <w:br/>
               <w:t xml:space="preserve">  },</w:t>
               <w:br/>
@@ -5917,23 +6003,23 @@
               <w:br/>
               <w:t xml:space="preserve">    {</w:t>
               <w:br/>
-              <w:t xml:space="preserve">      "action": "Implement cover cropping with legume-grass mixtures",</w:t>
+              <w:t xml:space="preserve">      "action": "Apply agricultural limestone to raise soil pH toward the optimal 6.0-7.0 range",</w:t>
               <w:br/>
-              <w:t xml:space="preserve">      "scientific_basis": "Cover crops add biomass and root exudates, increasing SOC through biological inputs...",</w:t>
+              <w:t xml:space="preserve">      "scientific_basis": "Carbonate dissolution neutralizes exchangeable acidity and precipitates toxic aluminum...",</w:t>
               <w:br/>
-              <w:t xml:space="preserve">      "metrics_affected": ["soil_organic_carbon", "soil_biodiversity", "nitrogen_cycling"],</w:t>
+              <w:t xml:space="preserve">      "metrics_affected": ["soil_ph", "aluminum_toxicity_reduction", "nutrient_availability"],</w:t>
               <w:br/>
-              <w:t xml:space="preserve">      "time_horizon": "1-3 years for measurable SOC increase; 5+ years for significant improvement",</w:t>
+              <w:t xml:space="preserve">      "time_horizon": "3-6 months for initial reaction; 1-2 years for full equilibrium",</w:t>
               <w:br/>
               <w:t xml:space="preserve">      "confidence": "high",</w:t>
               <w:br/>
-              <w:t xml:space="preserve">      "measurable_improvement": "Measurable SOC accumulation in topsoil over 3-5 years; reduces fertilizer needs"</w:t>
+              <w:t xml:space="preserve">      "measurable_improvement": "Raises soil pH toward target ranges, reducing toxic aluminum saturation (Brady &amp; Weil 2016)"</w:t>
               <w:br/>
               <w:t xml:space="preserve">    }</w:t>
               <w:br/>
               <w:t xml:space="preserve">  ],</w:t>
               <w:br/>
-              <w:t xml:space="preserve">  "source": "FAO Global Soil Organic Carbon Map (GSOCmap); Lal, R. (2004) Science; Brady &amp; Weil (2016)"</w:t>
+              <w:t xml:space="preserve">  "source": "Brady, N.C. &amp; Weil, R.R. (2016) The Nature and Properties of Soils, 15th Edition, Pearson; USDA-NRCS"</w:t>
               <w:br/>
               <w:t>}</w:t>
             </w:r>
@@ -5947,7 +6033,7 @@
         <w:spacing w:after="80"/>
       </w:pPr>
       <w:r>
-        <w:t>ChromaDB's Role: ChromaDB operates in persistent embedded mode (chromadb.PersistentClient), indexing the 57 chunks derived from knowledge.json using cosine distance. It acts as an authoritative scientific boundary, supplying retrieved evidence chunks that constrain the generative model.</w:t>
+        <w:t>ChromaDB's Role: ChromaDB operates in persistent embedded mode (chromadb.PersistentClient), indexing the 57 chunks derived from knowledge.json using cosine distance. It provides a retrieved scientific grounding layer that constrains the generative response, ensuring recommendations remain anchored in documented evidence.</w:t>
       </w:r>
     </w:p>
     <w:p>
@@ -6074,7 +6160,7 @@
         <w:spacing w:after="80"/>
       </w:pPr>
       <w:r>
-        <w:t>The system has been comprehensively validated through two dedicated automated test suites in the repository, achieving a verified 100% pass rate across all unit, integration, and scientific grounding criteria:</w:t>
+        <w:t>The system has been comprehensively validated through two dedicated automated test suites in the repository. The reasoning engine implements 5 compound 3-variable interaction rules in src/reasoning.py; test_final_audit.py programmatically exercises and validates 4 representative compound stress rules (Arid Heat-Drought, Biochemical Limitation, Monoculture Vulnerability, and Wetland Eutrophication) alongside single-variable threshold logic:</w:t>
       </w:r>
     </w:p>
     <w:tbl>
@@ -6244,7 +6330,7 @@
                 <w:color w:val="1F2937"/>
                 <w:sz w:val="18"/>
               </w:rPr>
-              <w:t>PASS (4/4 compound rules triggered)</w:t>
+              <w:t>PASS (4/4 representative compound interaction rules triggered in test_final_audit.py: Arid Heat-Drought, Biochemical Limitation, Monoculture Vulnerability, Wetland Eutrophication; 5 total rules implemented in src/reasoning.py)</w:t>
             </w:r>
           </w:p>
         </w:tc>
@@ -7016,13 +7102,13 @@
               </w:rPr>
               <w:t>Scientific Grounding Verification:</w:t>
               <w:br/>
-              <w:t>• Raw soil moisture percentage (e.g. 20%) is evaluated strictly as raw moisture percentage, NOT converted into percentage of field capacity.</w:t>
+              <w:t>• Raw soil moisture is evaluated as reported moisture rather than being converted into field-capacity units.</w:t>
               <w:br/>
-              <w:t>• The system does NOT assert that water stress begins below 30% field capacity when evaluating raw moisture percentages.</w:t>
+              <w:t>• The system maintains evidence-supported qualitative evaluations of water limitation without asserting unsupported field-capacity stress thresholds.</w:t>
               <w:br/>
-              <w:t>• Low SOC (e.g. 0.3%) is described qualitatively as 'very low / critically low soil organic carbon' without asserting ungrounded comparison baselines.</w:t>
+              <w:t>• Low SOC values are described qualitatively as 'very low / critically low soil organic carbon' without asserting ungrounded baseline comparisons.</w:t>
               <w:br/>
-              <w:t>• All ungrounded field-capacity targets, invented water-holding multipliers, and unbacked evaporation reductions are completely absent.</w:t>
+              <w:t>• Recommendations prioritize evidence-supported qualitative improvements where outcomes depend on local soil texture and site factors.</w:t>
             </w:r>
           </w:p>
         </w:tc>
@@ -7100,13 +7186,13 @@
           <w:b/>
           <w:color w:val="1F2937"/>
         </w:rPr>
-        <w:t xml:space="preserve">Final Production Commit: </w:t>
+        <w:t xml:space="preserve">Application Deployment Commit: </w:t>
       </w:r>
       <w:r>
         <w:rPr>
           <w:color w:val="374151"/>
         </w:rPr>
-        <w:t>Commit 678ea98 ('Refine soil moisture and SOC interpretations for scientific grounding').</w:t>
+        <w:t>Final application deployment commit: 678ea98 — Refine soil moisture and SOC interpretations for scientific grounding</w:t>
       </w:r>
     </w:p>
     <w:p>

</xml_diff>